<commit_message>
Präsentation mit Morph-Intro, Animationen und Diskussionsversion
- Intro-Folie, die per Morph in die Titelfolie übergeht; Edison und Tesla
  (mit Westinghouse-Logo) fliegen als Medaillons ein
- Folienaufbau animiert, Zeitstrahl Teil 1 → 2 per Morph
- Zweite Version mit Diskussionsblock: Handout-Fragen und Gruppenaufträge,
  Lösungen erscheinen absatzweise per Klick
- Beide Versionen zusätzlich als PDF; Playbook angepasst

Co-Authored-By: Claude Opus 5.5 <noreply@anthropic.com>
Claude-Session: https://claude.ai/code/session_01UhhNco9hoULthAG4fz8UGx
</commit_message>
<xml_diff>
--- a/vorbereitung/Playbook_und_Vorbereitung_Stromkrieg.docx
+++ b/vorbereitung/Playbook_und_Vorbereitung_Stromkrieg.docx
@@ -32,7 +32,7 @@
           <w:szCs w:val="20"/>
           <w:lang w:val="de-CH"/>
         </w:rPr>
-        <w:t xml:space="preserve">10 Minuten · 13 Folien · 10. Dezember 2026</w:t>
+        <w:t xml:space="preserve">10 Minuten · 14 Folien (mit Diskussion: 21) · 10. Dezember 2026</w:t>
       </w:r>
     </w:p>
     <w:p>
@@ -247,7 +247,7 @@
                 <w:szCs w:val="18"/>
                 <w:lang w:val="de-CH"/>
               </w:rPr>
-              <w:t xml:space="preserve">1–2 Titel, Auburn</w:t>
+              <w:t xml:space="preserve">1–3 Intro, Titel, Auburn</w:t>
             </w:r>
           </w:p>
         </w:tc>
@@ -268,7 +268,7 @@
                 <w:szCs w:val="18"/>
                 <w:lang w:val="de-CH"/>
               </w:rPr>
-              <w:t xml:space="preserve">«6. August 1890: Zum ersten Mal stirbt ein Mensch auf dem elektrischen Stuhl – mit Strom von Westinghouse. Den Generator hatte aber Edisons Lager beschafft.» Dann die Leitfrage: Warum gewann trotzdem der Wechselstrom?</w:t>
+              <w:t xml:space="preserve">Intro steht, während alle Platz nehmen. Ein Klick: Der Titel morpht, Edison und Tesla fliegen ein. Dann: «6. August 1890: Zum ersten Mal stirbt ein Mensch auf dem elektrischen Stuhl – mit Strom von Westinghouse. Den Generator hatte aber Edisons Lager beschafft.» Dann die Leitfrage: Warum gewann trotzdem der Wechselstrom?</w:t>
             </w:r>
           </w:p>
         </w:tc>
@@ -337,7 +337,7 @@
                 <w:szCs w:val="18"/>
                 <w:lang w:val="de-CH"/>
               </w:rPr>
-              <w:t xml:space="preserve">3 Spannung</w:t>
+              <w:t xml:space="preserve">4 Spannung</w:t>
             </w:r>
           </w:p>
         </w:tc>
@@ -427,7 +427,7 @@
                 <w:szCs w:val="18"/>
                 <w:lang w:val="de-CH"/>
               </w:rPr>
-              <w:t xml:space="preserve">4 Akteure</w:t>
+              <w:t xml:space="preserve">5 Akteure</w:t>
             </w:r>
           </w:p>
         </w:tc>
@@ -517,7 +517,7 @@
                 <w:szCs w:val="18"/>
                 <w:lang w:val="de-CH"/>
               </w:rPr>
-              <w:t xml:space="preserve">5 Verlauf I</w:t>
+              <w:t xml:space="preserve">6 Verlauf I</w:t>
             </w:r>
           </w:p>
         </w:tc>
@@ -607,7 +607,7 @@
                 <w:szCs w:val="18"/>
                 <w:lang w:val="de-CH"/>
               </w:rPr>
-              <w:t xml:space="preserve">6 Verlauf II</w:t>
+              <w:t xml:space="preserve">7 Verlauf II</w:t>
             </w:r>
           </w:p>
         </w:tc>
@@ -697,7 +697,7 @@
                 <w:szCs w:val="18"/>
                 <w:lang w:val="de-CH"/>
               </w:rPr>
-              <w:t xml:space="preserve">7 Warum</w:t>
+              <w:t xml:space="preserve">8 Warum</w:t>
             </w:r>
           </w:p>
         </w:tc>
@@ -787,7 +787,7 @@
                 <w:szCs w:val="18"/>
                 <w:lang w:val="de-CH"/>
               </w:rPr>
-              <w:t xml:space="preserve">8 Grafik</w:t>
+              <w:t xml:space="preserve">9 Grafik</w:t>
             </w:r>
           </w:p>
         </w:tc>
@@ -877,7 +877,7 @@
                 <w:szCs w:val="18"/>
                 <w:lang w:val="de-CH"/>
               </w:rPr>
-              <w:t xml:space="preserve">9 Zahlen</w:t>
+              <w:t xml:space="preserve">10 Zahlen</w:t>
             </w:r>
           </w:p>
         </w:tc>
@@ -967,7 +967,7 @@
                 <w:szCs w:val="18"/>
                 <w:lang w:val="de-CH"/>
               </w:rPr>
-              <w:t xml:space="preserve">10 Mythen</w:t>
+              <w:t xml:space="preserve">11 Mythen</w:t>
             </w:r>
           </w:p>
         </w:tc>
@@ -1057,7 +1057,7 @@
                 <w:szCs w:val="18"/>
                 <w:lang w:val="de-CH"/>
               </w:rPr>
-              <w:t xml:space="preserve">11–12 Fazit, Danke</w:t>
+              <w:t xml:space="preserve">12–13 Fazit, Danke</w:t>
             </w:r>
           </w:p>
         </w:tc>
@@ -1147,7 +1147,7 @@
                 <w:szCs w:val="18"/>
                 <w:lang w:val="de-CH"/>
               </w:rPr>
-              <w:t xml:space="preserve">13 Quellen</w:t>
+              <w:t xml:space="preserve">14 Quellen</w:t>
             </w:r>
           </w:p>
         </w:tc>
@@ -1214,6 +1214,38 @@
           <w:szCs w:val="20"/>
           <w:lang w:val="de-CH"/>
         </w:rPr>
+        <w:t xml:space="preserve">Version mit Diskussion</w:t>
+      </w:r>
+    </w:p>
+    <w:p>
+      <w:pPr>
+        <w:spacing w:before="0" w:after="200" w:line="264" w:lineRule="auto"/>
+      </w:pPr>
+      <w:r>
+        <w:rPr>
+          <w:rFonts w:ascii="Times New Roman" w:hAnsi="Times New Roman" w:cs="Times New Roman"/>
+          <w:color w:val="000000"/>
+          <w:sz w:val="20"/>
+          <w:szCs w:val="20"/>
+          <w:lang w:val="de-CH"/>
+        </w:rPr>
+        <w:t xml:space="preserve">Datei «…_mit_Diskussion»: Nach dem Fazit folgen sieben Folien – Kapitel «Diskussion», Handout Seite 1 und 2 (Fragen ans Plenum), die Gruppenaufträge (stehen lassen, solange die Gruppen arbeiten) und je eine Lösungsfolie pro Gruppe. Auf den Lösungsfolien erscheint jede Antwort erst per Klick: zuerst Antworten sammeln, dann klicken. Danach kommen «Danke» und die Quellen.</w:t>
+      </w:r>
+    </w:p>
+    <w:p>
+      <w:pPr>
+        <w:keepNext/>
+        <w:spacing w:before="0" w:after="80" w:line="264" w:lineRule="auto"/>
+      </w:pPr>
+      <w:r>
+        <w:rPr>
+          <w:rFonts w:ascii="Times New Roman" w:hAnsi="Times New Roman" w:cs="Times New Roman"/>
+          <w:b/>
+          <w:color w:val="000000"/>
+          <w:sz w:val="20"/>
+          <w:szCs w:val="20"/>
+          <w:lang w:val="de-CH"/>
+        </w:rPr>
         <w:t xml:space="preserve">Checkliste</w:t>
       </w:r>
     </w:p>
@@ -1278,7 +1310,39 @@
           <w:szCs w:val="20"/>
           <w:lang w:val="de-CH"/>
         </w:rPr>
-        <w:t xml:space="preserve">Übe dreimal laut mit Stoppuhr. Wirst du zu lang, kürze Folie 9 oder lass sie weg.</w:t>
+        <w:t xml:space="preserve">Übe dreimal laut mit Stoppuhr. Wirst du zu lang, kürze Folie 10 oder lass sie weg.</w:t>
+      </w:r>
+    </w:p>
+    <w:p>
+      <w:pPr>
+        <w:tabs>
+          <w:tab w:val="left" w:pos="720"/>
+        </w:tabs>
+        <w:spacing w:after="60" w:line="264" w:lineRule="auto"/>
+        <w:ind w:left="720" w:hanging="360"/>
+      </w:pPr>
+      <w:r>
+        <w:rPr>
+          <w:rFonts w:ascii="Times New Roman" w:hAnsi="Times New Roman" w:cs="Times New Roman"/>
+          <w:color w:val="000000"/>
+          <w:sz w:val="20"/>
+          <w:szCs w:val="20"/>
+          <w:lang w:val="de-CH"/>
+        </w:rPr>
+        <w:t xml:space="preserve">–</w:t>
+      </w:r>
+      <w:r>
+        <w:tab/>
+      </w:r>
+      <w:r>
+        <w:rPr>
+          <w:rFonts w:ascii="Times New Roman" w:hAnsi="Times New Roman" w:cs="Times New Roman"/>
+          <w:color w:val="000000"/>
+          <w:sz w:val="20"/>
+          <w:szCs w:val="20"/>
+          <w:lang w:val="de-CH"/>
+        </w:rPr>
+        <w:t xml:space="preserve">Die Animationen laufen automatisch. Warte, bis eine Folie fertig aufgebaut ist, bevor du klickst. Morph und Animationen funktionieren nur in PowerPoint (2019 oder Microsoft 365); im PDF sind alle Antworten schon sichtbar.</w:t>
       </w:r>
     </w:p>
     <w:p>
@@ -1342,7 +1406,39 @@
           <w:szCs w:val="20"/>
           <w:lang w:val="de-CH"/>
         </w:rPr>
-        <w:t xml:space="preserve">Installiere die Schriften Libre Baskerville und Source Sans 3 (kostenlos bei Google Fonts) oder nimm zusätzlich ein PDF der Folien mit. Im PDF sehen die Folien auf jedem Computer richtig aus.</w:t>
+        <w:t xml:space="preserve">Installiere die Schriften Libre Baskerville und Source Sans 3 (kostenlos bei Google Fonts) und nimm zusätzlich das PDF der Folien mit. Im PDF sehen die Folien auf jedem Computer richtig aus.</w:t>
+      </w:r>
+    </w:p>
+    <w:p>
+      <w:pPr>
+        <w:tabs>
+          <w:tab w:val="left" w:pos="720"/>
+        </w:tabs>
+        <w:spacing w:after="60" w:line="264" w:lineRule="auto"/>
+        <w:ind w:left="720" w:hanging="360"/>
+      </w:pPr>
+      <w:r>
+        <w:rPr>
+          <w:rFonts w:ascii="Times New Roman" w:hAnsi="Times New Roman" w:cs="Times New Roman"/>
+          <w:color w:val="000000"/>
+          <w:sz w:val="20"/>
+          <w:szCs w:val="20"/>
+          <w:lang w:val="de-CH"/>
+        </w:rPr>
+        <w:t xml:space="preserve">–</w:t>
+      </w:r>
+      <w:r>
+        <w:tab/>
+      </w:r>
+      <w:r>
+        <w:rPr>
+          <w:rFonts w:ascii="Times New Roman" w:hAnsi="Times New Roman" w:cs="Times New Roman"/>
+          <w:color w:val="000000"/>
+          <w:sz w:val="20"/>
+          <w:szCs w:val="20"/>
+          <w:lang w:val="de-CH"/>
+        </w:rPr>
+        <w:t xml:space="preserve">Optional: echte Fotos von Edison und Tesla und das Westinghouse-Logo in die Ovale der Titelfolie einsetzen – die Anleitung steht in den Notizen der Titelfolie.</w:t>
       </w:r>
     </w:p>
     <w:p>
@@ -1790,7 +1886,7 @@
                 <w:szCs w:val="20"/>
                 <w:lang w:val="de-CH"/>
               </w:rPr>
-              <w:t xml:space="preserve">Kurzer, zuverlässiger Überblick der Rutgers University. Grundlage für Folien 4–6. Online, ca. 15 Min.</w:t>
+              <w:t xml:space="preserve">Kurzer, zuverlässiger Überblick der Rutgers University. Grundlage für Folien 5–7. Online, ca. 15 Min.</w:t>
             </w:r>
           </w:p>
         </w:tc>
@@ -1884,7 +1980,7 @@
                 <w:szCs w:val="20"/>
                 <w:lang w:val="de-CH"/>
               </w:rPr>
-              <w:t xml:space="preserve">Hast du als PDF. Nur Einleitung und Schluss lesen (ca. 1 Std.): Warum Edisons Angstkampagne scheiterte. Für Folie 7.</w:t>
+              <w:t xml:space="preserve">Hast du als PDF. Nur Einleitung und Schluss lesen (ca. 1 Std.): Warum Edisons Angstkampagne scheiterte. Für Folie 8.</w:t>
             </w:r>
           </w:p>
         </w:tc>

</xml_diff>